<commit_message>
Add GAN project report
</commit_message>
<xml_diff>
--- a/report/GAN_Handwritten_Digit_Generation_Report.docx
+++ b/report/GAN_Handwritten_Digit_Generation_Report.docx
@@ -824,66 +824,41 @@
     </w:p>
     <w:p>
       <w:r>
-        <w:t>The project keeps its existing files and experiment folders. The main files and outputs used in this report are:</w:t>
-      </w:r>
-    </w:p>
-    <w:p>
-      <w:pPr>
-        <w:pStyle w:val="ListBullet"/>
-        <w:spacing w:after="40"/>
-      </w:pPr>
-      <w:r>
-        <w:t>src/train.py — training script (if present in the current project).</w:t>
-      </w:r>
-    </w:p>
-    <w:p>
-      <w:pPr>
-        <w:pStyle w:val="ListBullet"/>
-        <w:spacing w:after="40"/>
-      </w:pPr>
-      <w:r>
-        <w:t>src/models.py — Generator and Discriminator definitions.</w:t>
-      </w:r>
-    </w:p>
-    <w:p>
-      <w:pPr>
-        <w:pStyle w:val="ListBullet"/>
-        <w:spacing w:after="40"/>
-      </w:pPr>
-      <w:r>
-        <w:t>src/compare.py — experiment comparison script.</w:t>
-      </w:r>
-    </w:p>
-    <w:p>
-      <w:pPr>
-        <w:pStyle w:val="ListBullet"/>
-        <w:spacing w:after="40"/>
-      </w:pPr>
-      <w:r>
-        <w:t>src/diversity.py — pixel-level diversity calculation.</w:t>
-      </w:r>
-    </w:p>
-    <w:p>
-      <w:pPr>
-        <w:pStyle w:val="ListBullet"/>
-        <w:spacing w:after="40"/>
-      </w:pPr>
-      <w:r>
-        <w:t>results/ — experiment checkpoints, images, plots, and CSV summaries.</w:t>
-      </w:r>
-    </w:p>
-    <w:p>
-      <w:pPr>
-        <w:pStyle w:val="ListBullet"/>
-        <w:spacing w:after="40"/>
-      </w:pPr>
-      <w:r>
-        <w:t>report/project_report.md — project report notes, if maintained in the project.</w:t>
-      </w:r>
-    </w:p>
-    <w:p>
-      <w:r>
-        <w:t>The exact filenames above should be checked against the current project directory. No existing project files need to be renamed or moved.</w:t>
+        <w:drawing>
+          <wp:inline distT="0" distB="0" distL="0" distR="0" wp14:anchorId="60C0617D" wp14:editId="4F68D612">
+            <wp:extent cx="1455546" cy="2179509"/>
+            <wp:effectExtent l="0" t="0" r="0" b="0"/>
+            <wp:docPr id="1160114880" name="Picture 1"/>
+            <wp:cNvGraphicFramePr>
+              <a:graphicFrameLocks xmlns:a="http://schemas.openxmlformats.org/drawingml/2006/main" noChangeAspect="1"/>
+            </wp:cNvGraphicFramePr>
+            <a:graphic xmlns:a="http://schemas.openxmlformats.org/drawingml/2006/main">
+              <a:graphicData uri="http://schemas.openxmlformats.org/drawingml/2006/picture">
+                <pic:pic xmlns:pic="http://schemas.openxmlformats.org/drawingml/2006/picture">
+                  <pic:nvPicPr>
+                    <pic:cNvPr id="1160114880" name=""/>
+                    <pic:cNvPicPr/>
+                  </pic:nvPicPr>
+                  <pic:blipFill>
+                    <a:blip r:embed="rId9"/>
+                    <a:stretch>
+                      <a:fillRect/>
+                    </a:stretch>
+                  </pic:blipFill>
+                  <pic:spPr>
+                    <a:xfrm>
+                      <a:off x="0" y="0"/>
+                      <a:ext cx="1455546" cy="2179509"/>
+                    </a:xfrm>
+                    <a:prstGeom prst="rect">
+                      <a:avLst/>
+                    </a:prstGeom>
+                  </pic:spPr>
+                </pic:pic>
+              </a:graphicData>
+            </a:graphic>
+          </wp:inline>
+        </w:drawing>
       </w:r>
     </w:p>
     <w:p>
@@ -1344,6 +1319,76 @@
         <w:t>*The reduced-latent and increased-batch experiments are shown with baseline settings for other parameters; verify against the configuration in the training script.</w:t>
       </w:r>
     </w:p>
+    <w:p/>
+    <w:p>
+      <w:pPr>
+        <w:rPr>
+          <w:b/>
+          <w:bCs/>
+        </w:rPr>
+      </w:pPr>
+      <w:r>
+        <w:rPr>
+          <w:b/>
+          <w:bCs/>
+        </w:rPr>
+        <w:t xml:space="preserve">5.3. Source Code / </w:t>
+      </w:r>
+      <w:proofErr w:type="spellStart"/>
+      <w:r>
+        <w:rPr>
+          <w:b/>
+          <w:bCs/>
+        </w:rPr>
+        <w:t>Github</w:t>
+      </w:r>
+      <w:proofErr w:type="spellEnd"/>
+      <w:r>
+        <w:rPr>
+          <w:b/>
+          <w:bCs/>
+        </w:rPr>
+        <w:t xml:space="preserve"> Repository</w:t>
+      </w:r>
+      <w:r>
+        <w:rPr>
+          <w:b/>
+          <w:bCs/>
+        </w:rPr>
+        <w:t>:</w:t>
+      </w:r>
+    </w:p>
+    <w:p>
+      <w:pPr>
+        <w:rPr>
+          <w:b/>
+          <w:bCs/>
+        </w:rPr>
+      </w:pPr>
+      <w:r>
+        <w:rPr>
+          <w:b/>
+          <w:bCs/>
+        </w:rPr>
+        <w:t xml:space="preserve">                              </w:t>
+      </w:r>
+      <w:r>
+        <w:rPr>
+          <w:b/>
+          <w:bCs/>
+        </w:rPr>
+        <w:t>https://github.com/jaiudhaya85-gif/gan-synthetic-image-generation</w:t>
+      </w:r>
+    </w:p>
+    <w:p>
+      <w:pPr>
+        <w:rPr>
+          <w:b/>
+          <w:bCs/>
+        </w:rPr>
+      </w:pPr>
+    </w:p>
+    <w:p/>
     <w:p>
       <w:pPr>
         <w:pStyle w:val="Heading1"/>
@@ -1385,6 +1430,7 @@
                 <w:color w:val="FFFFFF"/>
                 <w:sz w:val="17"/>
               </w:rPr>
+              <w:lastRenderedPageBreak/>
               <w:t>Experiment</w:t>
             </w:r>
           </w:p>
@@ -1698,11 +1744,7 @@
     </w:tbl>
     <w:p>
       <w:r>
-        <w:t xml:space="preserve">The low-learning-rate experiment recorded the lowest final Generator loss (0.7927). The high-learning-rate experiment recorded the highest final Discriminator loss (1.2841). The increased-batch-size experiment had the </w:t>
-      </w:r>
-      <w:r>
-        <w:lastRenderedPageBreak/>
-        <w:t>lowest reported Generator-loss standard deviation (0.0500), indicating less variation in the recorded Generator losses across epochs. These metrics are preliminary and should be considered alongside the generated images.</w:t>
+        <w:t>The low-learning-rate experiment recorded the lowest final Generator loss (0.7927). The high-learning-rate experiment recorded the highest final Discriminator loss (1.2841). The increased-batch-size experiment had the lowest reported Generator-loss standard deviation (0.0500), indicating less variation in the recorded Generator losses across epochs. These metrics are preliminary and should be considered alongside the generated images.</w:t>
       </w:r>
     </w:p>
     <w:p>
@@ -2147,6 +2189,7 @@
     </w:p>
     <w:p>
       <w:r>
+        <w:lastRenderedPageBreak/>
         <w:t>The project also includes generated image samples, a comparison plot, and a pixel-level diversity calculation. Future work can include training for more epochs, repeating experiments with multiple random seeds, using stronger image-quality metrics, and comparing samples more systematically.</w:t>
       </w:r>
     </w:p>
@@ -2173,7 +2216,6 @@
         <w:spacing w:after="40"/>
       </w:pPr>
       <w:r>
-        <w:lastRenderedPageBreak/>
         <w:t>PyTorch Documentation — https://pytorch.org/docs/</w:t>
       </w:r>
     </w:p>
@@ -2205,8 +2247,8 @@
       </w:r>
     </w:p>
     <w:sectPr>
-      <w:headerReference w:type="default" r:id="rId9"/>
-      <w:footerReference w:type="default" r:id="rId10"/>
+      <w:headerReference w:type="default" r:id="rId10"/>
+      <w:footerReference w:type="default" r:id="rId11"/>
       <w:pgSz w:w="12240" w:h="15840"/>
       <w:pgMar w:top="936" w:right="1123" w:bottom="936" w:left="1123" w:header="720" w:footer="720" w:gutter="0"/>
       <w:cols w:space="720"/>
@@ -3115,7 +3157,6 @@
   <w:style w:type="character" w:default="1" w:styleId="DefaultParagraphFont">
     <w:name w:val="Default Paragraph Font"/>
     <w:uiPriority w:val="1"/>
-    <w:semiHidden/>
     <w:unhideWhenUsed/>
   </w:style>
   <w:style w:type="table" w:default="1" w:styleId="TableNormal">

</xml_diff>